<commit_message>
reviewed code for question 3, added more documentation and improvements for modularity in tlg_functions.R
</commit_message>
<xml_diff>
--- a/question_3_tlg/output/ae_summary_table.docx
+++ b/question_3_tlg/output/ae_summary_table.docx
@@ -32063,21 +32063,7 @@
                 <w:rFonts w:ascii="Calibri" w:hAnsi="Calibri"/>
                 <w:sz w:val="20"/>
               </w:rPr>
-              <w:t xml:space="preserve">n (%) = number (percentage) of subjects with at least one</w:t>
-            </w:r>
-            <w:r xmlns:w="http://schemas.openxmlformats.org/wordprocessingml/2006/main">
-              <w:rPr>
-                <w:rFonts w:ascii="Calibri" w:hAnsi="Calibri"/>
-                <w:sz w:val="20"/>
-              </w:rPr>
-              <w:t xml:space="preserve"> </w:t>
-            </w:r>
-            <w:r>
-              <w:rPr>
-                <w:rFonts w:ascii="Calibri" w:hAnsi="Calibri"/>
-                <w:sz w:val="20"/>
-              </w:rPr>
-              <w:t xml:space="preserve">event; a subject is counted once per row.</w:t>
+              <w:t xml:space="preserve">n (%)</w:t>
             </w:r>
           </w:p>
         </w:tc>

</xml_diff>